<commit_message>
feat: rediseno UI dashboard + fix 403 health-data + QA mobile
- Rediseno completo del dashboard (sidebar dark, glassmorphism login,
  cards mejoradas, graficos con gradientes, responsive)
- Sidebar sticky para que no se mueva al hacer scroll
- Navegacion de cards de pacientes a ficha individual
- Fix bug 403 en endpoint /health-data (comparacion user_id vs patient_id)
- Tests Playwright dashboard (8 tests) + mobile (10 tests)
- Scripts de grabacion de demo y actualizacion de PPTX
- Reportes QA actualizados (52 tests)
</commit_message>
<xml_diff>
--- a/qa/Reporte_QA_MoodIoT.docx
+++ b/qa/Reporte_QA_MoodIoT.docx
@@ -164,7 +164,7 @@
     </w:p>
     <w:p>
       <w:r>
-        <w:t>Perimetre : 42 cas de test repartis en 9 modules (Infrastructure, Verifications de sante, Authentification, Service Patient, Teleconsultation, Scoring, Gateway, Persistance BD, Dashboard Frontend).</w:t>
+        <w:t>Perimetre : 52 cas de test repartis en 10 modules (Infrastructure, Verifications de sante, Authentification, Service Patient, Teleconsultation, Scoring, Gateway, Persistance BD, Dashboard Frontend, App Mobile Health Connect).</w:t>
       </w:r>
     </w:p>
     <w:p>
@@ -173,7 +173,7 @@
           <w:b/>
           <w:color w:val="006100"/>
         </w:rPr>
-        <w:t>Resultat general : 42 REUSSIS | 0 ECHOUES | 0 En attente</w:t>
+        <w:t>Resultat general : 52 REUSSIS | 0 ECHOUES | 0 En attente</w:t>
       </w:r>
     </w:p>
     <w:p>
@@ -420,7 +420,7 @@
       <w:r>
         <w:drawing>
           <wp:inline xmlns:a="http://schemas.openxmlformats.org/drawingml/2006/main" xmlns:pic="http://schemas.openxmlformats.org/drawingml/2006/picture">
-            <wp:extent cx="5029200" cy="2844702"/>
+            <wp:extent cx="5029200" cy="3143250"/>
             <wp:docPr id="1" name="Picture 1"/>
             <wp:cNvGraphicFramePr>
               <a:graphicFrameLocks noChangeAspect="1"/>
@@ -441,7 +441,7 @@
                   <pic:spPr>
                     <a:xfrm>
                       <a:off x="0" y="0"/>
-                      <a:ext cx="5029200" cy="2844702"/>
+                      <a:ext cx="5029200" cy="3143250"/>
                     </a:xfrm>
                     <a:prstGeom prst="rect"/>
                   </pic:spPr>
@@ -472,7 +472,7 @@
       <w:r>
         <w:drawing>
           <wp:inline xmlns:a="http://schemas.openxmlformats.org/drawingml/2006/main" xmlns:pic="http://schemas.openxmlformats.org/drawingml/2006/picture">
-            <wp:extent cx="5029200" cy="2844702"/>
+            <wp:extent cx="5029200" cy="3143250"/>
             <wp:docPr id="2" name="Picture 2"/>
             <wp:cNvGraphicFramePr>
               <a:graphicFrameLocks noChangeAspect="1"/>
@@ -493,7 +493,7 @@
                   <pic:spPr>
                     <a:xfrm>
                       <a:off x="0" y="0"/>
-                      <a:ext cx="5029200" cy="2844702"/>
+                      <a:ext cx="5029200" cy="3143250"/>
                     </a:xfrm>
                     <a:prstGeom prst="rect"/>
                   </pic:spPr>
@@ -524,7 +524,7 @@
       <w:r>
         <w:drawing>
           <wp:inline xmlns:a="http://schemas.openxmlformats.org/drawingml/2006/main" xmlns:pic="http://schemas.openxmlformats.org/drawingml/2006/picture">
-            <wp:extent cx="5029200" cy="2847450"/>
+            <wp:extent cx="5029200" cy="3143250"/>
             <wp:docPr id="3" name="Picture 3"/>
             <wp:cNvGraphicFramePr>
               <a:graphicFrameLocks noChangeAspect="1"/>
@@ -545,7 +545,7 @@
                   <pic:spPr>
                     <a:xfrm>
                       <a:off x="0" y="0"/>
-                      <a:ext cx="5029200" cy="2847450"/>
+                      <a:ext cx="5029200" cy="3143250"/>
                     </a:xfrm>
                     <a:prstGeom prst="rect"/>
                   </pic:spPr>
@@ -588,7 +588,7 @@
       <w:r>
         <w:drawing>
           <wp:inline xmlns:a="http://schemas.openxmlformats.org/drawingml/2006/main" xmlns:pic="http://schemas.openxmlformats.org/drawingml/2006/picture">
-            <wp:extent cx="5029200" cy="2847450"/>
+            <wp:extent cx="5029200" cy="3685976"/>
             <wp:docPr id="4" name="Picture 4"/>
             <wp:cNvGraphicFramePr>
               <a:graphicFrameLocks noChangeAspect="1"/>
@@ -609,7 +609,7 @@
                   <pic:spPr>
                     <a:xfrm>
                       <a:off x="0" y="0"/>
-                      <a:ext cx="5029200" cy="2847450"/>
+                      <a:ext cx="5029200" cy="3685976"/>
                     </a:xfrm>
                     <a:prstGeom prst="rect"/>
                   </pic:spPr>
@@ -678,7 +678,7 @@
       <w:r>
         <w:drawing>
           <wp:inline xmlns:a="http://schemas.openxmlformats.org/drawingml/2006/main" xmlns:pic="http://schemas.openxmlformats.org/drawingml/2006/picture">
-            <wp:extent cx="5029200" cy="5645524"/>
+            <wp:extent cx="5029200" cy="3216023"/>
             <wp:docPr id="5" name="Picture 5"/>
             <wp:cNvGraphicFramePr>
               <a:graphicFrameLocks noChangeAspect="1"/>
@@ -699,7 +699,7 @@
                   <pic:spPr>
                     <a:xfrm>
                       <a:off x="0" y="0"/>
-                      <a:ext cx="5029200" cy="5645524"/>
+                      <a:ext cx="5029200" cy="3216023"/>
                     </a:xfrm>
                     <a:prstGeom prst="rect"/>
                   </pic:spPr>
@@ -730,7 +730,7 @@
       <w:r>
         <w:drawing>
           <wp:inline xmlns:a="http://schemas.openxmlformats.org/drawingml/2006/main" xmlns:pic="http://schemas.openxmlformats.org/drawingml/2006/picture">
-            <wp:extent cx="5029200" cy="2844702"/>
+            <wp:extent cx="5029200" cy="3143250"/>
             <wp:docPr id="6" name="Picture 6"/>
             <wp:cNvGraphicFramePr>
               <a:graphicFrameLocks noChangeAspect="1"/>
@@ -751,7 +751,7 @@
                   <pic:spPr>
                     <a:xfrm>
                       <a:off x="0" y="0"/>
-                      <a:ext cx="5029200" cy="2844702"/>
+                      <a:ext cx="5029200" cy="3143250"/>
                     </a:xfrm>
                     <a:prstGeom prst="rect"/>
                   </pic:spPr>
@@ -782,7 +782,7 @@
       <w:r>
         <w:drawing>
           <wp:inline xmlns:a="http://schemas.openxmlformats.org/drawingml/2006/main" xmlns:pic="http://schemas.openxmlformats.org/drawingml/2006/picture">
-            <wp:extent cx="5029200" cy="2844702"/>
+            <wp:extent cx="5029200" cy="3143250"/>
             <wp:docPr id="7" name="Picture 7"/>
             <wp:cNvGraphicFramePr>
               <a:graphicFrameLocks noChangeAspect="1"/>
@@ -803,7 +803,7 @@
                   <pic:spPr>
                     <a:xfrm>
                       <a:off x="0" y="0"/>
-                      <a:ext cx="5029200" cy="2844702"/>
+                      <a:ext cx="5029200" cy="3143250"/>
                     </a:xfrm>
                     <a:prstGeom prst="rect"/>
                   </pic:spPr>
@@ -834,7 +834,7 @@
       <w:r>
         <w:drawing>
           <wp:inline xmlns:a="http://schemas.openxmlformats.org/drawingml/2006/main" xmlns:pic="http://schemas.openxmlformats.org/drawingml/2006/picture">
-            <wp:extent cx="5029200" cy="3097133"/>
+            <wp:extent cx="5029200" cy="3143250"/>
             <wp:docPr id="8" name="Picture 8"/>
             <wp:cNvGraphicFramePr>
               <a:graphicFrameLocks noChangeAspect="1"/>
@@ -855,7 +855,7 @@
                   <pic:spPr>
                     <a:xfrm>
                       <a:off x="0" y="0"/>
-                      <a:ext cx="5029200" cy="3097133"/>
+                      <a:ext cx="5029200" cy="3143250"/>
                     </a:xfrm>
                     <a:prstGeom prst="rect"/>
                   </pic:spPr>
@@ -4756,6 +4756,798 @@
       </w:tr>
     </w:tbl>
     <w:p>
+      <w:pPr>
+        <w:pStyle w:val="Heading2"/>
+      </w:pPr>
+      <w:r>
+        <w:t>4.10 App Mobile Health Connect (UC10)</w:t>
+      </w:r>
+    </w:p>
+    <w:tbl>
+      <w:tblPr>
+        <w:tblW w:type="auto" w:w="0"/>
+        <w:jc w:val="center"/>
+        <w:tblLook w:firstColumn="1" w:firstRow="1" w:lastColumn="0" w:lastRow="0" w:noHBand="0" w:noVBand="1" w:val="04A0"/>
+        <w:tblBorders>
+          <w:top w:val="single" w:sz="4" w:space="0" w:color="4472C4"/>
+          <w:left w:val="single" w:sz="4" w:space="0" w:color="4472C4"/>
+          <w:bottom w:val="single" w:sz="4" w:space="0" w:color="4472C4"/>
+          <w:right w:val="single" w:sz="4" w:space="0" w:color="4472C4"/>
+          <w:insideH w:val="single" w:sz="4" w:space="0" w:color="4472C4"/>
+          <w:insideV w:val="single" w:sz="4" w:space="0" w:color="4472C4"/>
+        </w:tblBorders>
+      </w:tblPr>
+      <w:tblGrid>
+        <w:gridCol w:w="1728"/>
+        <w:gridCol w:w="1728"/>
+        <w:gridCol w:w="1728"/>
+        <w:gridCol w:w="1728"/>
+        <w:gridCol w:w="1728"/>
+      </w:tblGrid>
+      <w:tr>
+        <w:tc>
+          <w:tcPr>
+            <w:tcW w:type="dxa" w:w="1728"/>
+            <w:shd w:fill="1F4E79"/>
+          </w:tcPr>
+          <w:p>
+            <w:r>
+              <w:rPr>
+                <w:b/>
+                <w:color w:val="FFFFFF"/>
+                <w:sz w:val="18"/>
+              </w:rPr>
+              <w:t>ID</w:t>
+            </w:r>
+          </w:p>
+        </w:tc>
+        <w:tc>
+          <w:tcPr>
+            <w:tcW w:type="dxa" w:w="1728"/>
+            <w:shd w:fill="1F4E79"/>
+          </w:tcPr>
+          <w:p>
+            <w:r>
+              <w:rPr>
+                <w:b/>
+                <w:color w:val="FFFFFF"/>
+                <w:sz w:val="18"/>
+              </w:rPr>
+              <w:t>Type</w:t>
+            </w:r>
+          </w:p>
+        </w:tc>
+        <w:tc>
+          <w:tcPr>
+            <w:tcW w:type="dxa" w:w="1728"/>
+            <w:shd w:fill="1F4E79"/>
+          </w:tcPr>
+          <w:p>
+            <w:r>
+              <w:rPr>
+                <w:b/>
+                <w:color w:val="FFFFFF"/>
+                <w:sz w:val="18"/>
+              </w:rPr>
+              <w:t>Description</w:t>
+            </w:r>
+          </w:p>
+        </w:tc>
+        <w:tc>
+          <w:tcPr>
+            <w:tcW w:type="dxa" w:w="1728"/>
+            <w:shd w:fill="1F4E79"/>
+          </w:tcPr>
+          <w:p>
+            <w:r>
+              <w:rPr>
+                <w:b/>
+                <w:color w:val="FFFFFF"/>
+                <w:sz w:val="18"/>
+              </w:rPr>
+              <w:t>Resultat attendu</w:t>
+            </w:r>
+          </w:p>
+        </w:tc>
+        <w:tc>
+          <w:tcPr>
+            <w:tcW w:type="dxa" w:w="1728"/>
+            <w:shd w:fill="1F4E79"/>
+          </w:tcPr>
+          <w:p>
+            <w:r>
+              <w:rPr>
+                <w:b/>
+                <w:color w:val="FFFFFF"/>
+                <w:sz w:val="18"/>
+              </w:rPr>
+              <w:t>Etat</w:t>
+            </w:r>
+          </w:p>
+        </w:tc>
+      </w:tr>
+      <w:tr>
+        <w:tc>
+          <w:tcPr>
+            <w:tcW w:type="dxa" w:w="1728"/>
+          </w:tcPr>
+          <w:p>
+            <w:r>
+              <w:rPr>
+                <w:sz w:val="16"/>
+              </w:rPr>
+              <w:t>TC-UC10-01</w:t>
+            </w:r>
+          </w:p>
+        </w:tc>
+        <w:tc>
+          <w:tcPr>
+            <w:tcW w:type="dxa" w:w="1728"/>
+          </w:tcPr>
+          <w:p>
+            <w:r>
+              <w:rPr>
+                <w:sz w:val="16"/>
+              </w:rPr>
+              <w:t>Chemin nominal</w:t>
+            </w:r>
+          </w:p>
+        </w:tc>
+        <w:tc>
+          <w:tcPr>
+            <w:tcW w:type="dxa" w:w="1728"/>
+          </w:tcPr>
+          <w:p>
+            <w:r>
+              <w:rPr>
+                <w:sz w:val="16"/>
+              </w:rPr>
+              <w:t>Ecran de login app mobile</w:t>
+            </w:r>
+          </w:p>
+        </w:tc>
+        <w:tc>
+          <w:tcPr>
+            <w:tcW w:type="dxa" w:w="1728"/>
+          </w:tcPr>
+          <w:p>
+            <w:r>
+              <w:rPr>
+                <w:sz w:val="16"/>
+              </w:rPr>
+              <w:t>Formulaire de connexion affiche</w:t>
+            </w:r>
+          </w:p>
+        </w:tc>
+        <w:tc>
+          <w:tcPr>
+            <w:tcW w:type="dxa" w:w="1728"/>
+            <w:shd w:fill="C6EFCE"/>
+          </w:tcPr>
+          <w:p>
+            <w:r>
+              <w:rPr>
+                <w:sz w:val="16"/>
+              </w:rPr>
+              <w:t>Reussi</w:t>
+            </w:r>
+          </w:p>
+        </w:tc>
+      </w:tr>
+      <w:tr>
+        <w:tc>
+          <w:tcPr>
+            <w:tcW w:type="dxa" w:w="1728"/>
+          </w:tcPr>
+          <w:p>
+            <w:r>
+              <w:rPr>
+                <w:sz w:val="16"/>
+              </w:rPr>
+              <w:t>TC-UC10-02</w:t>
+            </w:r>
+          </w:p>
+        </w:tc>
+        <w:tc>
+          <w:tcPr>
+            <w:tcW w:type="dxa" w:w="1728"/>
+          </w:tcPr>
+          <w:p>
+            <w:r>
+              <w:rPr>
+                <w:sz w:val="16"/>
+              </w:rPr>
+              <w:t>Chemin nominal</w:t>
+            </w:r>
+          </w:p>
+        </w:tc>
+        <w:tc>
+          <w:tcPr>
+            <w:tcW w:type="dxa" w:w="1728"/>
+          </w:tcPr>
+          <w:p>
+            <w:r>
+              <w:rPr>
+                <w:sz w:val="16"/>
+              </w:rPr>
+              <w:t>Login en cours (spinner)</w:t>
+            </w:r>
+          </w:p>
+        </w:tc>
+        <w:tc>
+          <w:tcPr>
+            <w:tcW w:type="dxa" w:w="1728"/>
+          </w:tcPr>
+          <w:p>
+            <w:r>
+              <w:rPr>
+                <w:sz w:val="16"/>
+              </w:rPr>
+              <w:t>Spinner visible pendant la requete</w:t>
+            </w:r>
+          </w:p>
+        </w:tc>
+        <w:tc>
+          <w:tcPr>
+            <w:tcW w:type="dxa" w:w="1728"/>
+            <w:shd w:fill="C6EFCE"/>
+          </w:tcPr>
+          <w:p>
+            <w:r>
+              <w:rPr>
+                <w:sz w:val="16"/>
+              </w:rPr>
+              <w:t>Reussi</w:t>
+            </w:r>
+          </w:p>
+        </w:tc>
+      </w:tr>
+      <w:tr>
+        <w:tc>
+          <w:tcPr>
+            <w:tcW w:type="dxa" w:w="1728"/>
+          </w:tcPr>
+          <w:p>
+            <w:r>
+              <w:rPr>
+                <w:sz w:val="16"/>
+              </w:rPr>
+              <w:t>TC-UC10-03</w:t>
+            </w:r>
+          </w:p>
+        </w:tc>
+        <w:tc>
+          <w:tcPr>
+            <w:tcW w:type="dxa" w:w="1728"/>
+          </w:tcPr>
+          <w:p>
+            <w:r>
+              <w:rPr>
+                <w:sz w:val="16"/>
+              </w:rPr>
+              <w:t>Chemin nominal</w:t>
+            </w:r>
+          </w:p>
+        </w:tc>
+        <w:tc>
+          <w:tcPr>
+            <w:tcW w:type="dxa" w:w="1728"/>
+          </w:tcPr>
+          <w:p>
+            <w:r>
+              <w:rPr>
+                <w:sz w:val="16"/>
+              </w:rPr>
+              <w:t>Accueil apres login</w:t>
+            </w:r>
+          </w:p>
+        </w:tc>
+        <w:tc>
+          <w:tcPr>
+            <w:tcW w:type="dxa" w:w="1728"/>
+          </w:tcPr>
+          <w:p>
+            <w:r>
+              <w:rPr>
+                <w:sz w:val="16"/>
+              </w:rPr>
+              <w:t>Ecran principal avec nom du patient</w:t>
+            </w:r>
+          </w:p>
+        </w:tc>
+        <w:tc>
+          <w:tcPr>
+            <w:tcW w:type="dxa" w:w="1728"/>
+            <w:shd w:fill="C6EFCE"/>
+          </w:tcPr>
+          <w:p>
+            <w:r>
+              <w:rPr>
+                <w:sz w:val="16"/>
+              </w:rPr>
+              <w:t>Reussi</w:t>
+            </w:r>
+          </w:p>
+        </w:tc>
+      </w:tr>
+      <w:tr>
+        <w:tc>
+          <w:tcPr>
+            <w:tcW w:type="dxa" w:w="1728"/>
+          </w:tcPr>
+          <w:p>
+            <w:r>
+              <w:rPr>
+                <w:sz w:val="16"/>
+              </w:rPr>
+              <w:t>TC-UC10-04</w:t>
+            </w:r>
+          </w:p>
+        </w:tc>
+        <w:tc>
+          <w:tcPr>
+            <w:tcW w:type="dxa" w:w="1728"/>
+          </w:tcPr>
+          <w:p>
+            <w:r>
+              <w:rPr>
+                <w:sz w:val="16"/>
+              </w:rPr>
+              <w:t>Chemin nominal</w:t>
+            </w:r>
+          </w:p>
+        </w:tc>
+        <w:tc>
+          <w:tcPr>
+            <w:tcW w:type="dxa" w:w="1728"/>
+          </w:tcPr>
+          <w:p>
+            <w:r>
+              <w:rPr>
+                <w:sz w:val="16"/>
+              </w:rPr>
+              <w:t>Auto-sync Health Connect</w:t>
+            </w:r>
+          </w:p>
+        </w:tc>
+        <w:tc>
+          <w:tcPr>
+            <w:tcW w:type="dxa" w:w="1728"/>
+          </w:tcPr>
+          <w:p>
+            <w:r>
+              <w:rPr>
+                <w:sz w:val="16"/>
+              </w:rPr>
+              <w:t>Synchronisation automatique apres login</w:t>
+            </w:r>
+          </w:p>
+        </w:tc>
+        <w:tc>
+          <w:tcPr>
+            <w:tcW w:type="dxa" w:w="1728"/>
+            <w:shd w:fill="C6EFCE"/>
+          </w:tcPr>
+          <w:p>
+            <w:r>
+              <w:rPr>
+                <w:sz w:val="16"/>
+              </w:rPr>
+              <w:t>Reussi</w:t>
+            </w:r>
+          </w:p>
+        </w:tc>
+      </w:tr>
+      <w:tr>
+        <w:tc>
+          <w:tcPr>
+            <w:tcW w:type="dxa" w:w="1728"/>
+          </w:tcPr>
+          <w:p>
+            <w:r>
+              <w:rPr>
+                <w:sz w:val="16"/>
+              </w:rPr>
+              <w:t>TC-UC10-05</w:t>
+            </w:r>
+          </w:p>
+        </w:tc>
+        <w:tc>
+          <w:tcPr>
+            <w:tcW w:type="dxa" w:w="1728"/>
+          </w:tcPr>
+          <w:p>
+            <w:r>
+              <w:rPr>
+                <w:sz w:val="16"/>
+              </w:rPr>
+              <w:t>Chemin nominal</w:t>
+            </w:r>
+          </w:p>
+        </w:tc>
+        <w:tc>
+          <w:tcPr>
+            <w:tcW w:type="dxa" w:w="1728"/>
+          </w:tcPr>
+          <w:p>
+            <w:r>
+              <w:rPr>
+                <w:sz w:val="16"/>
+              </w:rPr>
+              <w:t>Sync terminee (badge vert)</w:t>
+            </w:r>
+          </w:p>
+        </w:tc>
+        <w:tc>
+          <w:tcPr>
+            <w:tcW w:type="dxa" w:w="1728"/>
+          </w:tcPr>
+          <w:p>
+            <w:r>
+              <w:rPr>
+                <w:sz w:val="16"/>
+              </w:rPr>
+              <w:t>Badge vert de succes affiche</w:t>
+            </w:r>
+          </w:p>
+        </w:tc>
+        <w:tc>
+          <w:tcPr>
+            <w:tcW w:type="dxa" w:w="1728"/>
+            <w:shd w:fill="C6EFCE"/>
+          </w:tcPr>
+          <w:p>
+            <w:r>
+              <w:rPr>
+                <w:sz w:val="16"/>
+              </w:rPr>
+              <w:t>Reussi</w:t>
+            </w:r>
+          </w:p>
+        </w:tc>
+      </w:tr>
+      <w:tr>
+        <w:tc>
+          <w:tcPr>
+            <w:tcW w:type="dxa" w:w="1728"/>
+          </w:tcPr>
+          <w:p>
+            <w:r>
+              <w:rPr>
+                <w:sz w:val="16"/>
+              </w:rPr>
+              <w:t>TC-UC10-06</w:t>
+            </w:r>
+          </w:p>
+        </w:tc>
+        <w:tc>
+          <w:tcPr>
+            <w:tcW w:type="dxa" w:w="1728"/>
+          </w:tcPr>
+          <w:p>
+            <w:r>
+              <w:rPr>
+                <w:sz w:val="16"/>
+              </w:rPr>
+              <w:t>Chemin nominal</w:t>
+            </w:r>
+          </w:p>
+        </w:tc>
+        <w:tc>
+          <w:tcPr>
+            <w:tcW w:type="dxa" w:w="1728"/>
+          </w:tcPr>
+          <w:p>
+            <w:r>
+              <w:rPr>
+                <w:sz w:val="16"/>
+              </w:rPr>
+              <w:t>Re-sync UPSERT</w:t>
+            </w:r>
+          </w:p>
+        </w:tc>
+        <w:tc>
+          <w:tcPr>
+            <w:tcW w:type="dxa" w:w="1728"/>
+          </w:tcPr>
+          <w:p>
+            <w:r>
+              <w:rPr>
+                <w:sz w:val="16"/>
+              </w:rPr>
+              <w:t>Mise a jour sans doublon en BD</w:t>
+            </w:r>
+          </w:p>
+        </w:tc>
+        <w:tc>
+          <w:tcPr>
+            <w:tcW w:type="dxa" w:w="1728"/>
+            <w:shd w:fill="C6EFCE"/>
+          </w:tcPr>
+          <w:p>
+            <w:r>
+              <w:rPr>
+                <w:sz w:val="16"/>
+              </w:rPr>
+              <w:t>Reussi</w:t>
+            </w:r>
+          </w:p>
+        </w:tc>
+      </w:tr>
+      <w:tr>
+        <w:tc>
+          <w:tcPr>
+            <w:tcW w:type="dxa" w:w="1728"/>
+          </w:tcPr>
+          <w:p>
+            <w:r>
+              <w:rPr>
+                <w:sz w:val="16"/>
+              </w:rPr>
+              <w:t>TC-UC10-07</w:t>
+            </w:r>
+          </w:p>
+        </w:tc>
+        <w:tc>
+          <w:tcPr>
+            <w:tcW w:type="dxa" w:w="1728"/>
+          </w:tcPr>
+          <w:p>
+            <w:r>
+              <w:rPr>
+                <w:sz w:val="16"/>
+              </w:rPr>
+              <w:t>Verification BD</w:t>
+            </w:r>
+          </w:p>
+        </w:tc>
+        <w:tc>
+          <w:tcPr>
+            <w:tcW w:type="dxa" w:w="1728"/>
+          </w:tcPr>
+          <w:p>
+            <w:r>
+              <w:rPr>
+                <w:sz w:val="16"/>
+              </w:rPr>
+              <w:t>Donnees dans PostgreSQL</w:t>
+            </w:r>
+          </w:p>
+        </w:tc>
+        <w:tc>
+          <w:tcPr>
+            <w:tcW w:type="dxa" w:w="1728"/>
+          </w:tcPr>
+          <w:p>
+            <w:r>
+              <w:rPr>
+                <w:sz w:val="16"/>
+              </w:rPr>
+              <w:t>Donnees presentes dans daily_aggregates</w:t>
+            </w:r>
+          </w:p>
+        </w:tc>
+        <w:tc>
+          <w:tcPr>
+            <w:tcW w:type="dxa" w:w="1728"/>
+            <w:shd w:fill="C6EFCE"/>
+          </w:tcPr>
+          <w:p>
+            <w:r>
+              <w:rPr>
+                <w:sz w:val="16"/>
+              </w:rPr>
+              <w:t>Reussi</w:t>
+            </w:r>
+          </w:p>
+        </w:tc>
+      </w:tr>
+      <w:tr>
+        <w:tc>
+          <w:tcPr>
+            <w:tcW w:type="dxa" w:w="1728"/>
+          </w:tcPr>
+          <w:p>
+            <w:r>
+              <w:rPr>
+                <w:sz w:val="16"/>
+              </w:rPr>
+              <w:t>TC-UC10-08</w:t>
+            </w:r>
+          </w:p>
+        </w:tc>
+        <w:tc>
+          <w:tcPr>
+            <w:tcW w:type="dxa" w:w="1728"/>
+          </w:tcPr>
+          <w:p>
+            <w:r>
+              <w:rPr>
+                <w:sz w:val="16"/>
+              </w:rPr>
+              <w:t>Chemin nominal</w:t>
+            </w:r>
+          </w:p>
+        </w:tc>
+        <w:tc>
+          <w:tcPr>
+            <w:tcW w:type="dxa" w:w="1728"/>
+          </w:tcPr>
+          <w:p>
+            <w:r>
+              <w:rPr>
+                <w:sz w:val="16"/>
+              </w:rPr>
+              <w:t>Batch sync 3 jours</w:t>
+            </w:r>
+          </w:p>
+        </w:tc>
+        <w:tc>
+          <w:tcPr>
+            <w:tcW w:type="dxa" w:w="1728"/>
+          </w:tcPr>
+          <w:p>
+            <w:r>
+              <w:rPr>
+                <w:sz w:val="16"/>
+              </w:rPr>
+              <w:t>3 enregistrements synchronises</w:t>
+            </w:r>
+          </w:p>
+        </w:tc>
+        <w:tc>
+          <w:tcPr>
+            <w:tcW w:type="dxa" w:w="1728"/>
+            <w:shd w:fill="C6EFCE"/>
+          </w:tcPr>
+          <w:p>
+            <w:r>
+              <w:rPr>
+                <w:sz w:val="16"/>
+              </w:rPr>
+              <w:t>Reussi</w:t>
+            </w:r>
+          </w:p>
+        </w:tc>
+      </w:tr>
+      <w:tr>
+        <w:tc>
+          <w:tcPr>
+            <w:tcW w:type="dxa" w:w="1728"/>
+          </w:tcPr>
+          <w:p>
+            <w:r>
+              <w:rPr>
+                <w:sz w:val="16"/>
+              </w:rPr>
+              <w:t>TC-UC10-09</w:t>
+            </w:r>
+          </w:p>
+        </w:tc>
+        <w:tc>
+          <w:tcPr>
+            <w:tcW w:type="dxa" w:w="1728"/>
+          </w:tcPr>
+          <w:p>
+            <w:r>
+              <w:rPr>
+                <w:sz w:val="16"/>
+              </w:rPr>
+              <w:t>Verification BD</w:t>
+            </w:r>
+          </w:p>
+        </w:tc>
+        <w:tc>
+          <w:tcPr>
+            <w:tcW w:type="dxa" w:w="1728"/>
+          </w:tcPr>
+          <w:p>
+            <w:r>
+              <w:rPr>
+                <w:sz w:val="16"/>
+              </w:rPr>
+              <w:t>Verification batch BD</w:t>
+            </w:r>
+          </w:p>
+        </w:tc>
+        <w:tc>
+          <w:tcPr>
+            <w:tcW w:type="dxa" w:w="1728"/>
+          </w:tcPr>
+          <w:p>
+            <w:r>
+              <w:rPr>
+                <w:sz w:val="16"/>
+              </w:rPr>
+              <w:t>Tous les enregistrements presents</w:t>
+            </w:r>
+          </w:p>
+        </w:tc>
+        <w:tc>
+          <w:tcPr>
+            <w:tcW w:type="dxa" w:w="1728"/>
+            <w:shd w:fill="C6EFCE"/>
+          </w:tcPr>
+          <w:p>
+            <w:r>
+              <w:rPr>
+                <w:sz w:val="16"/>
+              </w:rPr>
+              <w:t>Reussi</w:t>
+            </w:r>
+          </w:p>
+        </w:tc>
+      </w:tr>
+      <w:tr>
+        <w:tc>
+          <w:tcPr>
+            <w:tcW w:type="dxa" w:w="1728"/>
+          </w:tcPr>
+          <w:p>
+            <w:r>
+              <w:rPr>
+                <w:sz w:val="16"/>
+              </w:rPr>
+              <w:t>TC-UC10-10</w:t>
+            </w:r>
+          </w:p>
+        </w:tc>
+        <w:tc>
+          <w:tcPr>
+            <w:tcW w:type="dxa" w:w="1728"/>
+          </w:tcPr>
+          <w:p>
+            <w:r>
+              <w:rPr>
+                <w:sz w:val="16"/>
+              </w:rPr>
+              <w:t>Chemin nominal</w:t>
+            </w:r>
+          </w:p>
+        </w:tc>
+        <w:tc>
+          <w:tcPr>
+            <w:tcW w:type="dxa" w:w="1728"/>
+          </w:tcPr>
+          <w:p>
+            <w:r>
+              <w:rPr>
+                <w:sz w:val="16"/>
+              </w:rPr>
+              <w:t>Deconnexion app mobile</w:t>
+            </w:r>
+          </w:p>
+        </w:tc>
+        <w:tc>
+          <w:tcPr>
+            <w:tcW w:type="dxa" w:w="1728"/>
+          </w:tcPr>
+          <w:p>
+            <w:r>
+              <w:rPr>
+                <w:sz w:val="16"/>
+              </w:rPr>
+              <w:t>Retour a l'ecran de login</w:t>
+            </w:r>
+          </w:p>
+        </w:tc>
+        <w:tc>
+          <w:tcPr>
+            <w:tcW w:type="dxa" w:w="1728"/>
+            <w:shd w:fill="C6EFCE"/>
+          </w:tcPr>
+          <w:p>
+            <w:r>
+              <w:rPr>
+                <w:sz w:val="16"/>
+              </w:rPr>
+              <w:t>Reussi</w:t>
+            </w:r>
+          </w:p>
+        </w:tc>
+      </w:tr>
+    </w:tbl>
+    <w:p>
       <w:r>
         <w:br w:type="page"/>
       </w:r>
@@ -4788,7 +5580,7 @@
       <w:r>
         <w:drawing>
           <wp:inline xmlns:a="http://schemas.openxmlformats.org/drawingml/2006/main" xmlns:pic="http://schemas.openxmlformats.org/drawingml/2006/picture">
-            <wp:extent cx="5029200" cy="2844702"/>
+            <wp:extent cx="5029200" cy="3143250"/>
             <wp:docPr id="9" name="Picture 9"/>
             <wp:cNvGraphicFramePr>
               <a:graphicFrameLocks noChangeAspect="1"/>
@@ -4809,7 +5601,7 @@
                   <pic:spPr>
                     <a:xfrm>
                       <a:off x="0" y="0"/>
-                      <a:ext cx="5029200" cy="2844702"/>
+                      <a:ext cx="5029200" cy="3143250"/>
                     </a:xfrm>
                     <a:prstGeom prst="rect"/>
                   </pic:spPr>
@@ -4840,7 +5632,7 @@
       <w:r>
         <w:drawing>
           <wp:inline xmlns:a="http://schemas.openxmlformats.org/drawingml/2006/main" xmlns:pic="http://schemas.openxmlformats.org/drawingml/2006/picture">
-            <wp:extent cx="5029200" cy="2844702"/>
+            <wp:extent cx="5029200" cy="3143250"/>
             <wp:docPr id="10" name="Picture 10"/>
             <wp:cNvGraphicFramePr>
               <a:graphicFrameLocks noChangeAspect="1"/>
@@ -4861,7 +5653,7 @@
                   <pic:spPr>
                     <a:xfrm>
                       <a:off x="0" y="0"/>
-                      <a:ext cx="5029200" cy="2844702"/>
+                      <a:ext cx="5029200" cy="3143250"/>
                     </a:xfrm>
                     <a:prstGeom prst="rect"/>
                   </pic:spPr>
@@ -4892,7 +5684,7 @@
       <w:r>
         <w:drawing>
           <wp:inline xmlns:a="http://schemas.openxmlformats.org/drawingml/2006/main" xmlns:pic="http://schemas.openxmlformats.org/drawingml/2006/picture">
-            <wp:extent cx="5029200" cy="2847450"/>
+            <wp:extent cx="5029200" cy="3143250"/>
             <wp:docPr id="11" name="Picture 11"/>
             <wp:cNvGraphicFramePr>
               <a:graphicFrameLocks noChangeAspect="1"/>
@@ -4913,7 +5705,7 @@
                   <pic:spPr>
                     <a:xfrm>
                       <a:off x="0" y="0"/>
-                      <a:ext cx="5029200" cy="2847450"/>
+                      <a:ext cx="5029200" cy="3143250"/>
                     </a:xfrm>
                     <a:prstGeom prst="rect"/>
                   </pic:spPr>
@@ -4944,7 +5736,7 @@
       <w:r>
         <w:drawing>
           <wp:inline xmlns:a="http://schemas.openxmlformats.org/drawingml/2006/main" xmlns:pic="http://schemas.openxmlformats.org/drawingml/2006/picture">
-            <wp:extent cx="5029200" cy="5645524"/>
+            <wp:extent cx="5029200" cy="3216023"/>
             <wp:docPr id="12" name="Picture 12"/>
             <wp:cNvGraphicFramePr>
               <a:graphicFrameLocks noChangeAspect="1"/>
@@ -4965,7 +5757,7 @@
                   <pic:spPr>
                     <a:xfrm>
                       <a:off x="0" y="0"/>
-                      <a:ext cx="5029200" cy="5645524"/>
+                      <a:ext cx="5029200" cy="3216023"/>
                     </a:xfrm>
                     <a:prstGeom prst="rect"/>
                   </pic:spPr>
@@ -4996,7 +5788,7 @@
       <w:r>
         <w:drawing>
           <wp:inline xmlns:a="http://schemas.openxmlformats.org/drawingml/2006/main" xmlns:pic="http://schemas.openxmlformats.org/drawingml/2006/picture">
-            <wp:extent cx="5029200" cy="2847450"/>
+            <wp:extent cx="5029200" cy="3685976"/>
             <wp:docPr id="13" name="Picture 13"/>
             <wp:cNvGraphicFramePr>
               <a:graphicFrameLocks noChangeAspect="1"/>
@@ -5017,7 +5809,7 @@
                   <pic:spPr>
                     <a:xfrm>
                       <a:off x="0" y="0"/>
-                      <a:ext cx="5029200" cy="2847450"/>
+                      <a:ext cx="5029200" cy="3685976"/>
                     </a:xfrm>
                     <a:prstGeom prst="rect"/>
                   </pic:spPr>
@@ -5048,7 +5840,7 @@
       <w:r>
         <w:drawing>
           <wp:inline xmlns:a="http://schemas.openxmlformats.org/drawingml/2006/main" xmlns:pic="http://schemas.openxmlformats.org/drawingml/2006/picture">
-            <wp:extent cx="5029200" cy="2844702"/>
+            <wp:extent cx="5029200" cy="3143250"/>
             <wp:docPr id="14" name="Picture 14"/>
             <wp:cNvGraphicFramePr>
               <a:graphicFrameLocks noChangeAspect="1"/>
@@ -5069,7 +5861,7 @@
                   <pic:spPr>
                     <a:xfrm>
                       <a:off x="0" y="0"/>
-                      <a:ext cx="5029200" cy="2844702"/>
+                      <a:ext cx="5029200" cy="3143250"/>
                     </a:xfrm>
                     <a:prstGeom prst="rect"/>
                   </pic:spPr>
@@ -5100,7 +5892,7 @@
       <w:r>
         <w:drawing>
           <wp:inline xmlns:a="http://schemas.openxmlformats.org/drawingml/2006/main" xmlns:pic="http://schemas.openxmlformats.org/drawingml/2006/picture">
-            <wp:extent cx="5029200" cy="2844702"/>
+            <wp:extent cx="5029200" cy="3143250"/>
             <wp:docPr id="15" name="Picture 15"/>
             <wp:cNvGraphicFramePr>
               <a:graphicFrameLocks noChangeAspect="1"/>
@@ -5121,7 +5913,7 @@
                   <pic:spPr>
                     <a:xfrm>
                       <a:off x="0" y="0"/>
-                      <a:ext cx="5029200" cy="2844702"/>
+                      <a:ext cx="5029200" cy="3143250"/>
                     </a:xfrm>
                     <a:prstGeom prst="rect"/>
                   </pic:spPr>
@@ -5152,7 +5944,7 @@
       <w:r>
         <w:drawing>
           <wp:inline xmlns:a="http://schemas.openxmlformats.org/drawingml/2006/main" xmlns:pic="http://schemas.openxmlformats.org/drawingml/2006/picture">
-            <wp:extent cx="5029200" cy="3097133"/>
+            <wp:extent cx="5029200" cy="3143250"/>
             <wp:docPr id="16" name="Picture 16"/>
             <wp:cNvGraphicFramePr>
               <a:graphicFrameLocks noChangeAspect="1"/>
@@ -5173,7 +5965,7 @@
                   <pic:spPr>
                     <a:xfrm>
                       <a:off x="0" y="0"/>
-                      <a:ext cx="5029200" cy="3097133"/>
+                      <a:ext cx="5029200" cy="3143250"/>
                     </a:xfrm>
                     <a:prstGeom prst="rect"/>
                   </pic:spPr>
@@ -6706,6 +7498,646 @@
     </w:p>
     <w:p/>
     <w:p>
+      <w:pPr>
+        <w:pStyle w:val="Heading2"/>
+      </w:pPr>
+      <w:r>
+        <w:t>5.10 App Mobile Health Connect</w:t>
+      </w:r>
+    </w:p>
+    <w:p>
+      <w:pPr>
+        <w:jc w:val="center"/>
+      </w:pPr>
+      <w:r>
+        <w:drawing>
+          <wp:inline xmlns:a="http://schemas.openxmlformats.org/drawingml/2006/main" xmlns:pic="http://schemas.openxmlformats.org/drawingml/2006/picture">
+            <wp:extent cx="5029200" cy="3233057"/>
+            <wp:docPr id="17" name="Picture 17"/>
+            <wp:cNvGraphicFramePr>
+              <a:graphicFrameLocks noChangeAspect="1"/>
+            </wp:cNvGraphicFramePr>
+            <a:graphic>
+              <a:graphicData uri="http://schemas.openxmlformats.org/drawingml/2006/picture">
+                <pic:pic>
+                  <pic:nvPicPr>
+                    <pic:cNvPr id="0" name="sc_mob_01_login.png"/>
+                    <pic:cNvPicPr/>
+                  </pic:nvPicPr>
+                  <pic:blipFill>
+                    <a:blip r:embed="rId17"/>
+                    <a:stretch>
+                      <a:fillRect/>
+                    </a:stretch>
+                  </pic:blipFill>
+                  <pic:spPr>
+                    <a:xfrm>
+                      <a:off x="0" y="0"/>
+                      <a:ext cx="5029200" cy="3233057"/>
+                    </a:xfrm>
+                    <a:prstGeom prst="rect"/>
+                  </pic:spPr>
+                </pic:pic>
+              </a:graphicData>
+            </a:graphic>
+          </wp:inline>
+        </w:drawing>
+      </w:r>
+    </w:p>
+    <w:p>
+      <w:pPr>
+        <w:jc w:val="center"/>
+      </w:pPr>
+      <w:r>
+        <w:rPr>
+          <w:i/>
+          <w:sz w:val="18"/>
+        </w:rPr>
+        <w:t>Figure MOB-01 : Ecran de login app mobile</w:t>
+      </w:r>
+    </w:p>
+    <w:p/>
+    <w:p>
+      <w:pPr>
+        <w:jc w:val="center"/>
+      </w:pPr>
+      <w:r>
+        <w:drawing>
+          <wp:inline xmlns:a="http://schemas.openxmlformats.org/drawingml/2006/main" xmlns:pic="http://schemas.openxmlformats.org/drawingml/2006/picture">
+            <wp:extent cx="5029200" cy="3233057"/>
+            <wp:docPr id="18" name="Picture 18"/>
+            <wp:cNvGraphicFramePr>
+              <a:graphicFrameLocks noChangeAspect="1"/>
+            </wp:cNvGraphicFramePr>
+            <a:graphic>
+              <a:graphicData uri="http://schemas.openxmlformats.org/drawingml/2006/picture">
+                <pic:pic>
+                  <pic:nvPicPr>
+                    <pic:cNvPr id="0" name="sc_mob_02_login_loading.png"/>
+                    <pic:cNvPicPr/>
+                  </pic:nvPicPr>
+                  <pic:blipFill>
+                    <a:blip r:embed="rId18"/>
+                    <a:stretch>
+                      <a:fillRect/>
+                    </a:stretch>
+                  </pic:blipFill>
+                  <pic:spPr>
+                    <a:xfrm>
+                      <a:off x="0" y="0"/>
+                      <a:ext cx="5029200" cy="3233057"/>
+                    </a:xfrm>
+                    <a:prstGeom prst="rect"/>
+                  </pic:spPr>
+                </pic:pic>
+              </a:graphicData>
+            </a:graphic>
+          </wp:inline>
+        </w:drawing>
+      </w:r>
+    </w:p>
+    <w:p>
+      <w:pPr>
+        <w:jc w:val="center"/>
+      </w:pPr>
+      <w:r>
+        <w:rPr>
+          <w:i/>
+          <w:sz w:val="18"/>
+        </w:rPr>
+        <w:t>Figure MOB-02 : Login en cours (spinner)</w:t>
+      </w:r>
+    </w:p>
+    <w:p/>
+    <w:p>
+      <w:pPr>
+        <w:jc w:val="center"/>
+      </w:pPr>
+      <w:r>
+        <w:drawing>
+          <wp:inline xmlns:a="http://schemas.openxmlformats.org/drawingml/2006/main" xmlns:pic="http://schemas.openxmlformats.org/drawingml/2006/picture">
+            <wp:extent cx="5029200" cy="3233057"/>
+            <wp:docPr id="19" name="Picture 19"/>
+            <wp:cNvGraphicFramePr>
+              <a:graphicFrameLocks noChangeAspect="1"/>
+            </wp:cNvGraphicFramePr>
+            <a:graphic>
+              <a:graphicData uri="http://schemas.openxmlformats.org/drawingml/2006/picture">
+                <pic:pic>
+                  <pic:nvPicPr>
+                    <pic:cNvPr id="0" name="sc_mob_03_accueil.png"/>
+                    <pic:cNvPicPr/>
+                  </pic:nvPicPr>
+                  <pic:blipFill>
+                    <a:blip r:embed="rId19"/>
+                    <a:stretch>
+                      <a:fillRect/>
+                    </a:stretch>
+                  </pic:blipFill>
+                  <pic:spPr>
+                    <a:xfrm>
+                      <a:off x="0" y="0"/>
+                      <a:ext cx="5029200" cy="3233057"/>
+                    </a:xfrm>
+                    <a:prstGeom prst="rect"/>
+                  </pic:spPr>
+                </pic:pic>
+              </a:graphicData>
+            </a:graphic>
+          </wp:inline>
+        </w:drawing>
+      </w:r>
+    </w:p>
+    <w:p>
+      <w:pPr>
+        <w:jc w:val="center"/>
+      </w:pPr>
+      <w:r>
+        <w:rPr>
+          <w:i/>
+          <w:sz w:val="18"/>
+        </w:rPr>
+        <w:t>Figure MOB-03 : Accueil apres login</w:t>
+      </w:r>
+    </w:p>
+    <w:p/>
+    <w:p>
+      <w:pPr>
+        <w:jc w:val="center"/>
+      </w:pPr>
+      <w:r>
+        <w:drawing>
+          <wp:inline xmlns:a="http://schemas.openxmlformats.org/drawingml/2006/main" xmlns:pic="http://schemas.openxmlformats.org/drawingml/2006/picture">
+            <wp:extent cx="5029200" cy="3233057"/>
+            <wp:docPr id="20" name="Picture 20"/>
+            <wp:cNvGraphicFramePr>
+              <a:graphicFrameLocks noChangeAspect="1"/>
+            </wp:cNvGraphicFramePr>
+            <a:graphic>
+              <a:graphicData uri="http://schemas.openxmlformats.org/drawingml/2006/picture">
+                <pic:pic>
+                  <pic:nvPicPr>
+                    <pic:cNvPr id="0" name="sc_mob_04_sync_loading.png"/>
+                    <pic:cNvPicPr/>
+                  </pic:nvPicPr>
+                  <pic:blipFill>
+                    <a:blip r:embed="rId20"/>
+                    <a:stretch>
+                      <a:fillRect/>
+                    </a:stretch>
+                  </pic:blipFill>
+                  <pic:spPr>
+                    <a:xfrm>
+                      <a:off x="0" y="0"/>
+                      <a:ext cx="5029200" cy="3233057"/>
+                    </a:xfrm>
+                    <a:prstGeom prst="rect"/>
+                  </pic:spPr>
+                </pic:pic>
+              </a:graphicData>
+            </a:graphic>
+          </wp:inline>
+        </w:drawing>
+      </w:r>
+    </w:p>
+    <w:p>
+      <w:pPr>
+        <w:jc w:val="center"/>
+      </w:pPr>
+      <w:r>
+        <w:rPr>
+          <w:i/>
+          <w:sz w:val="18"/>
+        </w:rPr>
+        <w:t>Figure MOB-04 : Synchronisation en cours</w:t>
+      </w:r>
+    </w:p>
+    <w:p/>
+    <w:p>
+      <w:pPr>
+        <w:jc w:val="center"/>
+      </w:pPr>
+      <w:r>
+        <w:drawing>
+          <wp:inline xmlns:a="http://schemas.openxmlformats.org/drawingml/2006/main" xmlns:pic="http://schemas.openxmlformats.org/drawingml/2006/picture">
+            <wp:extent cx="5029200" cy="3233057"/>
+            <wp:docPr id="21" name="Picture 21"/>
+            <wp:cNvGraphicFramePr>
+              <a:graphicFrameLocks noChangeAspect="1"/>
+            </wp:cNvGraphicFramePr>
+            <a:graphic>
+              <a:graphicData uri="http://schemas.openxmlformats.org/drawingml/2006/picture">
+                <pic:pic>
+                  <pic:nvPicPr>
+                    <pic:cNvPr id="0" name="sc_mob_05_sync_ok.png"/>
+                    <pic:cNvPicPr/>
+                  </pic:nvPicPr>
+                  <pic:blipFill>
+                    <a:blip r:embed="rId21"/>
+                    <a:stretch>
+                      <a:fillRect/>
+                    </a:stretch>
+                  </pic:blipFill>
+                  <pic:spPr>
+                    <a:xfrm>
+                      <a:off x="0" y="0"/>
+                      <a:ext cx="5029200" cy="3233057"/>
+                    </a:xfrm>
+                    <a:prstGeom prst="rect"/>
+                  </pic:spPr>
+                </pic:pic>
+              </a:graphicData>
+            </a:graphic>
+          </wp:inline>
+        </w:drawing>
+      </w:r>
+    </w:p>
+    <w:p>
+      <w:pPr>
+        <w:jc w:val="center"/>
+      </w:pPr>
+      <w:r>
+        <w:rPr>
+          <w:i/>
+          <w:sz w:val="18"/>
+        </w:rPr>
+        <w:t>Figure MOB-05 : Synchronisation reussie (badge vert)</w:t>
+      </w:r>
+    </w:p>
+    <w:p/>
+    <w:p>
+      <w:pPr>
+        <w:jc w:val="center"/>
+      </w:pPr>
+      <w:r>
+        <w:drawing>
+          <wp:inline xmlns:a="http://schemas.openxmlformats.org/drawingml/2006/main" xmlns:pic="http://schemas.openxmlformats.org/drawingml/2006/picture">
+            <wp:extent cx="5029200" cy="3233057"/>
+            <wp:docPr id="22" name="Picture 22"/>
+            <wp:cNvGraphicFramePr>
+              <a:graphicFrameLocks noChangeAspect="1"/>
+            </wp:cNvGraphicFramePr>
+            <a:graphic>
+              <a:graphicData uri="http://schemas.openxmlformats.org/drawingml/2006/picture">
+                <pic:pic>
+                  <pic:nvPicPr>
+                    <pic:cNvPr id="0" name="sc_mob_06_resync.png"/>
+                    <pic:cNvPicPr/>
+                  </pic:nvPicPr>
+                  <pic:blipFill>
+                    <a:blip r:embed="rId22"/>
+                    <a:stretch>
+                      <a:fillRect/>
+                    </a:stretch>
+                  </pic:blipFill>
+                  <pic:spPr>
+                    <a:xfrm>
+                      <a:off x="0" y="0"/>
+                      <a:ext cx="5029200" cy="3233057"/>
+                    </a:xfrm>
+                    <a:prstGeom prst="rect"/>
+                  </pic:spPr>
+                </pic:pic>
+              </a:graphicData>
+            </a:graphic>
+          </wp:inline>
+        </w:drawing>
+      </w:r>
+    </w:p>
+    <w:p>
+      <w:pPr>
+        <w:jc w:val="center"/>
+      </w:pPr>
+      <w:r>
+        <w:rPr>
+          <w:i/>
+          <w:sz w:val="18"/>
+        </w:rPr>
+        <w:t>Figure MOB-06 : Re-synchronisation UPSERT</w:t>
+      </w:r>
+    </w:p>
+    <w:p/>
+    <w:p>
+      <w:r>
+        <w:rPr>
+          <w:rFonts w:ascii="Consolas" w:hAnsi="Consolas"/>
+          <w:sz w:val="16"/>
+        </w:rPr>
+        <w:t>=== Verification PostgreSQL — daily_aggregates ===</w:t>
+        <w:br/>
+        <w:t>Date d'execution: 2026-04-12T15:15:51.791261</w:t>
+        <w:br/>
+        <w:t>Patient: c0000000-0000-0000-0000-000000000001 (Sophie Dupont)</w:t>
+        <w:br/>
+        <w:t>Requete: SELECT date, heart_rate_avg, step_count, sleep_duration_min,</w:t>
+        <w:br/>
+        <w:t xml:space="preserve">                         source_platform, synced_at</w:t>
+        <w:br/>
+        <w:t xml:space="preserve">                  FROM daily_aggregates</w:t>
+        <w:br/>
+        <w:t xml:space="preserve">                  WHERE patient_id = 'c0000000-0000-0000-0000-000000000001'</w:t>
+        <w:br/>
+        <w:t xml:space="preserve">                  ORDER BY date DESC</w:t>
+        <w:br/>
+        <w:t xml:space="preserve">                  LIMIT 5;</w:t>
+        <w:br/>
+        <w:br/>
+        <w:t>Resultat:</w:t>
+        <w:br/>
+        <w:t xml:space="preserve">    date    | heart_rate_avg | step_count | sleep_duration_min |    source_platform     |           synced_at           </w:t>
+        <w:br/>
+        <w:t>------------+----------------+------------+--------------------+------------------------+-------------------------------</w:t>
+        <w:br/>
+        <w:t xml:space="preserve"> 2026-04-12 |             80 |      11566 |                447 | android_health_connect | 2026-04-12 21:15:49.537114+00</w:t>
+        <w:br/>
+        <w:t xml:space="preserve"> 2026-04-11 |             74 |       9100 |                450 | android_health_connect | 2026-04-12 19:55:13.545441+00</w:t>
+        <w:br/>
+        <w:t xml:space="preserve"> 2026-04-10 |             71 |       7800 |                420 | android_health_connect | 2026-04-12 19:55:13.526742+00</w:t>
+        <w:br/>
+        <w:t xml:space="preserve"> 2026-04-09 |             68 |       6200 |                390 | android_health_connect | 2026-04-12 19:55:13.457679+00</w:t>
+        <w:br/>
+        <w:t xml:space="preserve"> 2026-04-08 |             73 |       8900 |                445 | android_health_connect | 2026-04-12 20:19:59.900564+00</w:t>
+        <w:br/>
+        <w:t>(5 rows)</w:t>
+        <w:br/>
+        <w:br/>
+        <w:br/>
+        <w:br/>
+        <w:t>Conclusion: Les donnees Health Connect sont bien presentes dans PostgreSQL.</w:t>
+        <w:br/>
+        <w:t>L'UPSERT fonctionne — une seule ligne par (patient_id, date).</w:t>
+        <w:br/>
+      </w:r>
+    </w:p>
+    <w:p>
+      <w:pPr>
+        <w:jc w:val="center"/>
+      </w:pPr>
+      <w:r>
+        <w:rPr>
+          <w:i/>
+          <w:sz w:val="18"/>
+        </w:rPr>
+        <w:t>Evidence MOB-07 : Verification PostgreSQL</w:t>
+      </w:r>
+    </w:p>
+    <w:p/>
+    <w:p>
+      <w:r>
+        <w:rPr>
+          <w:rFonts w:ascii="Consolas" w:hAnsi="Consolas"/>
+          <w:sz w:val="16"/>
+        </w:rPr>
+        <w:t>{</w:t>
+        <w:br/>
+        <w:t xml:space="preserve">  "test": "Batch sync — 3 jours de donnees offline",</w:t>
+        <w:br/>
+        <w:t xml:space="preserve">  "endpoint": "POST /patients/c0000000-0000-0000-0000-000000000001/health-data/batch",</w:t>
+        <w:br/>
+        <w:t xml:space="preserve">  "payload_sent": [</w:t>
+        <w:br/>
+        <w:t xml:space="preserve">    {</w:t>
+        <w:br/>
+        <w:t xml:space="preserve">      "date": "2026-04-06",</w:t>
+        <w:br/>
+        <w:t xml:space="preserve">      "heart_rate_avg": 66,</w:t>
+        <w:br/>
+        <w:t xml:space="preserve">      "step_count": 5200,</w:t>
+        <w:br/>
+        <w:t xml:space="preserve">      "sleep_duration_min": 380,</w:t>
+        <w:br/>
+        <w:t xml:space="preserve">      "source_platform": "android_health_connect"</w:t>
+        <w:br/>
+        <w:t xml:space="preserve">    },</w:t>
+        <w:br/>
+        <w:t xml:space="preserve">    {</w:t>
+        <w:br/>
+        <w:t xml:space="preserve">      "date": "2026-04-07",</w:t>
+        <w:br/>
+        <w:t xml:space="preserve">      "heart_rate_avg": 70,</w:t>
+        <w:br/>
+        <w:t xml:space="preserve">      "step_count": 7400,</w:t>
+        <w:br/>
+        <w:t xml:space="preserve">      "sleep_duration_min": 410,</w:t>
+        <w:br/>
+        <w:t xml:space="preserve">      "source_platform": "android_health_connect"</w:t>
+        <w:br/>
+        <w:t xml:space="preserve">    },</w:t>
+        <w:br/>
+        <w:t xml:space="preserve">    {</w:t>
+        <w:br/>
+        <w:t xml:space="preserve">      "date": "2026-04-08",</w:t>
+        <w:br/>
+        <w:t xml:space="preserve">      "heart_rate_avg": 73,</w:t>
+        <w:br/>
+        <w:t xml:space="preserve">      "step_count": 8900,</w:t>
+        <w:br/>
+        <w:t xml:space="preserve">      "sleep_duration_min": 445,</w:t>
+        <w:br/>
+        <w:t xml:space="preserve">      "source_platform": "android_health_connect"</w:t>
+        <w:br/>
+        <w:t xml:space="preserve">    }</w:t>
+        <w:br/>
+        <w:t xml:space="preserve">  ],</w:t>
+        <w:br/>
+        <w:t xml:space="preserve">  "response": {</w:t>
+        <w:br/>
+        <w:t xml:space="preserve">    "patient_id": "c0000000-0000-0000-0000-000000000001",</w:t>
+        <w:br/>
+        <w:t xml:space="preserve">    "synced_count": 3,</w:t>
+        <w:br/>
+        <w:t xml:space="preserve">    "synced_at": "2026-04-12T21:15:52.495874+00:00",</w:t>
+        <w:br/>
+        <w:t xml:space="preserve">    "results": [</w:t>
+        <w:br/>
+        <w:t xml:space="preserve">      {</w:t>
+        <w:br/>
+        <w:t xml:space="preserve">        "patient_id": "c0000000-0000-0000-0000-000000000001",</w:t>
+        <w:br/>
+        <w:t xml:space="preserve">        "date": "2026-04-06",</w:t>
+        <w:br/>
+        <w:t xml:space="preserve">        "source_platform": "android_health_connect",</w:t>
+        <w:br/>
+        <w:t xml:space="preserve">        "synced_at": "2026-04-12T21:15:52.463511+00:00",</w:t>
+        <w:br/>
+        <w:t xml:space="preserve">        "upserted": true</w:t>
+        <w:br/>
+        <w:t xml:space="preserve">      },</w:t>
+        <w:br/>
+        <w:t xml:space="preserve">      {</w:t>
+        <w:br/>
+        <w:t xml:space="preserve">        "patient_id": "c0000000-0000-0000-0000-000000000001",</w:t>
+        <w:br/>
+        <w:t xml:space="preserve">        "date": "2026-04-07",</w:t>
+        <w:br/>
+        <w:t xml:space="preserve">        "source_platform": "android_health_connect",</w:t>
+        <w:br/>
+        <w:t xml:space="preserve">        "synced_at": "2026-04-12T21:15:52.476963+00:00",</w:t>
+        <w:br/>
+        <w:t xml:space="preserve">        "upserted": true</w:t>
+        <w:br/>
+        <w:t xml:space="preserve">      },</w:t>
+        <w:br/>
+        <w:t xml:space="preserve">      {</w:t>
+        <w:br/>
+        <w:t xml:space="preserve">        "patient_id": "c0000000-0000-0000-0000-000000000001",</w:t>
+        <w:br/>
+        <w:t xml:space="preserve">        "date": "2026-04-08",</w:t>
+        <w:br/>
+        <w:t xml:space="preserve">        "source_platform": "android_health_connect",</w:t>
+        <w:br/>
+        <w:t xml:space="preserve">        "synced_at": "2026-04-12T21:15:52.485605+00:00",</w:t>
+        <w:br/>
+        <w:t xml:space="preserve">        "upserted": true</w:t>
+        <w:br/>
+        <w:t xml:space="preserve">      }</w:t>
+        <w:br/>
+        <w:t xml:space="preserve">    ]</w:t>
+        <w:br/>
+        <w:t xml:space="preserve">  },</w:t>
+        <w:br/>
+        <w:t xml:space="preserve">  "timestamp": "2026-04-12T15:15:52.547237"</w:t>
+        <w:br/>
+        <w:t>}</w:t>
+      </w:r>
+    </w:p>
+    <w:p>
+      <w:pPr>
+        <w:jc w:val="center"/>
+      </w:pPr>
+      <w:r>
+        <w:rPr>
+          <w:i/>
+          <w:sz w:val="18"/>
+        </w:rPr>
+        <w:t>Evidence MOB-08 : Batch sync 3 jours (JSON)</w:t>
+      </w:r>
+    </w:p>
+    <w:p/>
+    <w:p>
+      <w:r>
+        <w:rPr>
+          <w:rFonts w:ascii="Consolas" w:hAnsi="Consolas"/>
+          <w:sz w:val="16"/>
+        </w:rPr>
+        <w:t>=== Verification PostgreSQL — Apres Batch Sync ===</w:t>
+        <w:br/>
+        <w:t>Date d'execution: 2026-04-12T15:15:54.038800</w:t>
+        <w:br/>
+        <w:t>Patient: c0000000-0000-0000-0000-000000000001 (Sophie Dupont)</w:t>
+        <w:br/>
+        <w:t xml:space="preserve">Total enregistrements: count </w:t>
+        <w:br/>
+        <w:t>-------</w:t>
+        <w:br/>
+        <w:t xml:space="preserve">     7</w:t>
+        <w:br/>
+        <w:t>(1 row)</w:t>
+        <w:br/>
+        <w:br/>
+        <w:t>Tous les daily_aggregates:</w:t>
+        <w:br/>
+        <w:t xml:space="preserve">    date    | heart_rate_avg | step_count | sleep_duration_min |    source_platform     </w:t>
+        <w:br/>
+        <w:t>------------+----------------+------------+--------------------+------------------------</w:t>
+        <w:br/>
+        <w:t xml:space="preserve"> 2026-04-06 |             66 |       5200 |                380 | android_health_connect</w:t>
+        <w:br/>
+        <w:t xml:space="preserve"> 2026-04-07 |             70 |       7400 |                410 | android_health_connect</w:t>
+        <w:br/>
+        <w:t xml:space="preserve"> 2026-04-08 |             73 |       8900 |                445 | android_health_connect</w:t>
+        <w:br/>
+        <w:t xml:space="preserve"> 2026-04-09 |             68 |       6200 |                390 | android_health_connect</w:t>
+        <w:br/>
+        <w:t xml:space="preserve"> 2026-04-10 |             71 |       7800 |                420 | android_health_connect</w:t>
+        <w:br/>
+        <w:t xml:space="preserve"> 2026-04-11 |             74 |       9100 |                450 | android_health_connect</w:t>
+        <w:br/>
+        <w:t xml:space="preserve"> 2026-04-12 |             80 |      11566 |                447 | android_health_connect</w:t>
+        <w:br/>
+        <w:t>(7 rows)</w:t>
+        <w:br/>
+        <w:br/>
+        <w:br/>
+        <w:br/>
+        <w:t>Conclusion:</w:t>
+        <w:br/>
+        <w:t>- Sync individuel (via app): OK</w:t>
+        <w:br/>
+        <w:t>- UPSERT (pas de doublon): OK</w:t>
+        <w:br/>
+        <w:t>- Batch sync (3 jours offline): OK</w:t>
+        <w:br/>
+        <w:t>- source_platform = android_health_connect: OK</w:t>
+        <w:br/>
+      </w:r>
+    </w:p>
+    <w:p>
+      <w:pPr>
+        <w:jc w:val="center"/>
+      </w:pPr>
+      <w:r>
+        <w:rPr>
+          <w:i/>
+          <w:sz w:val="18"/>
+        </w:rPr>
+        <w:t>Evidence MOB-09 : Verification batch en BD</w:t>
+      </w:r>
+    </w:p>
+    <w:p/>
+    <w:p>
+      <w:pPr>
+        <w:jc w:val="center"/>
+      </w:pPr>
+      <w:r>
+        <w:drawing>
+          <wp:inline xmlns:a="http://schemas.openxmlformats.org/drawingml/2006/main" xmlns:pic="http://schemas.openxmlformats.org/drawingml/2006/picture">
+            <wp:extent cx="5029200" cy="3233057"/>
+            <wp:docPr id="23" name="Picture 23"/>
+            <wp:cNvGraphicFramePr>
+              <a:graphicFrameLocks noChangeAspect="1"/>
+            </wp:cNvGraphicFramePr>
+            <a:graphic>
+              <a:graphicData uri="http://schemas.openxmlformats.org/drawingml/2006/picture">
+                <pic:pic>
+                  <pic:nvPicPr>
+                    <pic:cNvPr id="0" name="sc_mob_10_logout.png"/>
+                    <pic:cNvPicPr/>
+                  </pic:nvPicPr>
+                  <pic:blipFill>
+                    <a:blip r:embed="rId23"/>
+                    <a:stretch>
+                      <a:fillRect/>
+                    </a:stretch>
+                  </pic:blipFill>
+                  <pic:spPr>
+                    <a:xfrm>
+                      <a:off x="0" y="0"/>
+                      <a:ext cx="5029200" cy="3233057"/>
+                    </a:xfrm>
+                    <a:prstGeom prst="rect"/>
+                  </pic:spPr>
+                </pic:pic>
+              </a:graphicData>
+            </a:graphic>
+          </wp:inline>
+        </w:drawing>
+      </w:r>
+    </w:p>
+    <w:p>
+      <w:pPr>
+        <w:jc w:val="center"/>
+      </w:pPr>
+      <w:r>
+        <w:rPr>
+          <w:i/>
+          <w:sz w:val="18"/>
+        </w:rPr>
+        <w:t>Figure MOB-10 : Deconnexion app mobile</w:t>
+      </w:r>
+    </w:p>
+    <w:p/>
+    <w:p>
       <w:r>
         <w:br w:type="page"/>
       </w:r>
@@ -6739,7 +8171,7 @@
         <w:pStyle w:val="ListBullet"/>
       </w:pPr>
       <w:r>
-        <w:t>Sur 42 cas de test : 42 REUSSIS (100%), 0 ECHOUES, 0 En attente.</w:t>
+        <w:t>Sur 52 cas de test : 52 REUSSIS (100%), 0 ECHOUES, 0 En attente.</w:t>
       </w:r>
     </w:p>
     <w:p>

</xml_diff>